<commit_message>
JCIM package: SI (Tables S1-S5), TOC graphic, cover letter, package checks; archive v1
- identity audit: the 6 PubChem lookups that failed on 2026-09-22 resolved
  (5 KRAS correct; TNBC abemaciclib wrong) -> 55 of 128 wrong, not 54
- fix: abstract hyphens were turned into minus signs
- cite the pre-audit Zenodo deposits of the four studies and of v1
- figures at 7.0 in exactly (ACS double column); MIT LICENSE added
- v1 Beilstein files moved to _archivo/nano-qsar-limpieza-2026-09-22/methods_v1_beilstein

Co-Authored-By: Claude Opus 5.5 <noreply@anthropic.com>
</commit_message>
<xml_diff>
--- a/manuscript/submission/Manuscript_Audit_JCIM.docx
+++ b/manuscript/submission/Manuscript_Audit_JCIM.docx
@@ -77,7 +77,7 @@
       </w:pPr>
       <w:r>
         <w:rPr/>
-        <w:t>Computational screens of two−dimensional materials as drug carriers combine semiempirical adsorption energies, docking and quantitative structure–property relationship (QSPR) models, and they are usually validated with cross−validation and Y−randomization. We rebuilt four such screens from raw inputs — KRAS−G12D with graphitic carbon nitride, PARP1 with a B</w:t>
+        <w:t>Computational screens of two-dimensional materials as drug carriers combine semiempirical adsorption energies, docking and quantitative structure–property relationship (QSPR) models, and they are usually validated with cross-validation and Y-randomization. We rebuilt four such screens from raw inputs — KRAS-G12D with graphitic carbon nitride, PARP1 with a B</w:t>
       </w:r>
       <w:r>
         <w:rPr>
@@ -137,7 +137,7 @@
       </w:r>
       <w:r>
         <w:rPr/>
-        <w:t xml:space="preserve"> borophene — and found eight failure modes that this validation cannot detect. Of 128 drug structures, 54 encoded a different compound; three of the four carrier models contained bonds the material cannot have; a borophene flake reconstructed during adsorption, which turned 17 of 28 drugs into apparent chemisorbers against 3 on a stable sheet; GFN2−xTB and GFN1−xTB could not describe the metallic MXene; two docking protocols failed or could not fail their controls; a virtual screen contained no structures; a drug overlapped its periodic image; and a leak−free QSPR model that was significant on energies from an invalid carrier (</w:t>
+        <w:t xml:space="preserve"> borophene — and found eight failure modes that this validation cannot detect. Of 128 drug structures, 55 encoded a different compound; three of the four carrier models contained bonds the material cannot have; a borophene flake reconstructed during adsorption, which turned 17 of 28 drugs into apparent chemisorbers against 3 on a stable sheet; GFN2-xTB and GFN1-xTB could not describe the metallic MXene; two docking protocols failed or could not fail their controls; a virtual screen contained no structures; a drug overlapped its periodic image; and a leak-free QSPR model that was significant on energies from an invalid carrier (</w:t>
       </w:r>
       <w:r>
         <w:rPr>
@@ -348,7 +348,7 @@
       </w:r>
       <w:r>
         <w:rPr/>
-        <w:t xml:space="preserve"> borophene. All four had been written up for publication, with QSPR models validated by the protocol described above. Rebuilding each one from raw inputs with scripts revealed eight distinct failure modes, from the identity of the molecules (54 of 128 structures encoded a different compound) to the validity of the carrier models and of the methods applied to them. The most instructive case is the QSPR model of the KRAS study: the same leak-free nested cross-validation, with the same four descriptors and the same 33 drugs, gives </w:t>
+        <w:t xml:space="preserve"> borophene. All four had been written up for publication, with QSPR models validated by the protocol described above. Rebuilding each one from raw inputs with scripts revealed eight distinct failure modes, from the identity of the molecules (55 of 128 structures encoded a different compound) to the validity of the carrier models and of the methods applied to them. The most instructive case is the QSPR model of the KRAS study: the same leak-free nested cross-validation, with the same four descriptors and the same 33 drugs, gives </w:t>
       </w:r>
       <w:r>
         <w:rPr>
@@ -428,7 +428,17 @@
       </w:pPr>
       <w:r>
         <w:rPr/>
-        <w:t>Each study paired a disease target with a cohort of drugs and a carrier model (Table 1). Before the audit, each existed as a code repository, a data set and a manuscript. The audit rebuilt every study from its raw inputs (drug names, Protein Data Bank structures, carrier lattices) with scripts that regenerate every number and figure. Files from before the rebuild were moved to an archive and never deleted, so that each failure mode can be shown with the original files.</w:t>
+        <w:t>Each study paired a disease target with a cohort of drugs and a carrier model (Table 1). Before the audit, each existed as a code repository, a data set and a manuscript; the supporting files of all four, and a methods description built on them, had been deposited on Zenodo</w:t>
+      </w:r>
+      <w:r>
+        <w:rPr>
+          <w:vertAlign w:val="superscript"/>
+        </w:rPr>
+        <w:t>21–25</w:t>
+      </w:r>
+      <w:r>
+        <w:rPr/>
+        <w:t>. Those records are the pre-audit state that this paper corrects. The audit rebuilt every study from its raw inputs (drug names, Protein Data Bank structures, carrier lattices) with scripts that regenerate every number and figure. Files from before the rebuild were moved to an archive and never deleted, so that each failure mode can be shown with the original files.</w:t>
       </w:r>
     </w:p>
     <w:p>
@@ -458,7 +468,7 @@
       <w:r>
         <w:drawing>
           <wp:inline xmlns:a="http://schemas.openxmlformats.org/drawingml/2006/main" xmlns:pic="http://schemas.openxmlformats.org/drawingml/2006/picture">
-            <wp:extent cx="6264000" cy="1715778"/>
+            <wp:extent cx="6264000" cy="1725583"/>
             <wp:docPr id="1" name="Picture 1"/>
             <wp:cNvGraphicFramePr>
               <a:graphicFrameLocks noChangeAspect="1"/>
@@ -479,7 +489,7 @@
                   <pic:spPr>
                     <a:xfrm>
                       <a:off x="0" y="0"/>
-                      <a:ext cx="6264000" cy="1715778"/>
+                      <a:ext cx="6264000" cy="1725583"/>
                     </a:xfrm>
                     <a:prstGeom prst="rect"/>
                   </pic:spPr>
@@ -534,7 +544,7 @@
         <w:rPr>
           <w:vertAlign w:val="superscript"/>
         </w:rPr>
-        <w:t>21</w:t>
+        <w:t>26</w:t>
       </w:r>
       <w:r>
         <w:rPr/>
@@ -682,7 +692,7 @@
         <w:rPr>
           <w:vertAlign w:val="superscript"/>
         </w:rPr>
-        <w:t>22</w:t>
+        <w:t>27</w:t>
       </w:r>
       <w:r>
         <w:rPr/>
@@ -708,7 +718,7 @@
         <w:rPr>
           <w:vertAlign w:val="superscript"/>
         </w:rPr>
-        <w:t>23</w:t>
+        <w:t>28</w:t>
       </w:r>
       <w:r>
         <w:rPr/>
@@ -766,7 +776,7 @@
         <w:rPr>
           <w:vertAlign w:val="superscript"/>
         </w:rPr>
-        <w:t>24</w:t>
+        <w:t>29</w:t>
       </w:r>
       <w:r>
         <w:rPr/>
@@ -825,7 +835,7 @@
         <w:rPr>
           <w:vertAlign w:val="superscript"/>
         </w:rPr>
-        <w:t>25</w:t>
+        <w:t>30</w:t>
       </w:r>
       <w:r>
         <w:rPr/>
@@ -835,7 +845,7 @@
         <w:rPr>
           <w:vertAlign w:val="superscript"/>
         </w:rPr>
-        <w:t>26</w:t>
+        <w:t>31</w:t>
       </w:r>
       <w:r>
         <w:rPr/>
@@ -845,7 +855,7 @@
         <w:rPr>
           <w:vertAlign w:val="superscript"/>
         </w:rPr>
-        <w:t>27</w:t>
+        <w:t>32</w:t>
       </w:r>
       <w:r>
         <w:rPr/>
@@ -1516,7 +1526,7 @@
       </w:pPr>
       <w:r>
         <w:rPr/>
-        <w:t>Of the 128 drug structures in the four data sets, 54 encoded a different compound from the one named (Figure 2a): none of 33 in the KRAS study, but 23 of 33 for TNBC, 17 of 33 for glioblastoma and 14 of 29 for tau. Some errors changed the molecule beyond recognition: everolimus in the glioblastoma set was stored as C</w:t>
+        <w:t>Of the 128 drug structures in the four data sets, 55 encoded a different compound from the one named (Figure 2a, Table S1): none of 33 in the KRAS study, but 24 of 33 for TNBC, 17 of 33 for glioblastoma and 14 of 29 for tau. Some errors changed the molecule beyond recognition: everolimus in the glioblastoma set was stored as C</w:t>
       </w:r>
       <w:r>
         <w:rPr>
@@ -1605,7 +1615,7 @@
       </w:pPr>
       <w:r>
         <w:rPr/>
-        <w:t>Three of the four carrier models were not the materials they were named after (Figure 2b). The B</w:t>
+        <w:t>Three of the four carrier models were not the materials they were named after (Figure 2b, Table S2). The B</w:t>
       </w:r>
       <w:r>
         <w:rPr>
@@ -1822,7 +1832,7 @@
       <w:r>
         <w:drawing>
           <wp:inline xmlns:a="http://schemas.openxmlformats.org/drawingml/2006/main" xmlns:pic="http://schemas.openxmlformats.org/drawingml/2006/picture">
-            <wp:extent cx="6264000" cy="2742768"/>
+            <wp:extent cx="6264000" cy="2756558"/>
             <wp:docPr id="2" name="Picture 2"/>
             <wp:cNvGraphicFramePr>
               <a:graphicFrameLocks noChangeAspect="1"/>
@@ -1843,7 +1853,7 @@
                   <pic:spPr>
                     <a:xfrm>
                       <a:off x="0" y="0"/>
-                      <a:ext cx="6264000" cy="2742768"/>
+                      <a:ext cx="6264000" cy="2756558"/>
                     </a:xfrm>
                     <a:prstGeom prst="rect"/>
                   </pic:spPr>
@@ -1935,7 +1945,7 @@
       </w:r>
       <w:r>
         <w:rPr/>
-        <w:t xml:space="preserve"> (Figure 3a): the free flake contracted toward a compact boron cluster, and the computed binding energies contained the energy of that reconstruction. The classification of the drugs followed: 17 of 28 appeared to chemisorb (Figure 3b), and the earlier version of this work presented that result as a hidden chemisorption regime. Borophene exists only on a supporting metal</w:t>
+        <w:t xml:space="preserve"> (Figure 3a, Table S3): the free flake contracted toward a compact boron cluster, and the computed binding energies contained the energy of that reconstruction. The classification of the drugs followed: 17 of 28 appeared to chemisorb (Figure 3b), and the earlier version of this work presented that result as a hidden chemisorption regime. Borophene exists only on a supporting metal</w:t>
       </w:r>
       <w:r>
         <w:rPr>
@@ -2046,7 +2056,7 @@
       <w:r>
         <w:drawing>
           <wp:inline xmlns:a="http://schemas.openxmlformats.org/drawingml/2006/main" xmlns:pic="http://schemas.openxmlformats.org/drawingml/2006/picture">
-            <wp:extent cx="6264000" cy="2507684"/>
+            <wp:extent cx="6264000" cy="2520963"/>
             <wp:docPr id="3" name="Picture 3"/>
             <wp:cNvGraphicFramePr>
               <a:graphicFrameLocks noChangeAspect="1"/>
@@ -2067,7 +2077,7 @@
                   <pic:spPr>
                     <a:xfrm>
                       <a:off x="0" y="0"/>
-                      <a:ext cx="6264000" cy="2507684"/>
+                      <a:ext cx="6264000" cy="2520963"/>
                     </a:xfrm>
                     <a:prstGeom prst="rect"/>
                   </pic:spPr>
@@ -2155,7 +2165,7 @@
         <w:rPr>
           <w:vertAlign w:val="superscript"/>
         </w:rPr>
-        <w:t>28</w:t>
+        <w:t>33</w:t>
       </w:r>
       <w:r>
         <w:rPr/>
@@ -2165,7 +2175,7 @@
         <w:rPr>
           <w:vertAlign w:val="superscript"/>
         </w:rPr>
-        <w:t>6,22</w:t>
+        <w:t>6,27</w:t>
       </w:r>
       <w:r>
         <w:rPr/>
@@ -2180,7 +2190,7 @@
       <w:r>
         <w:drawing>
           <wp:inline xmlns:a="http://schemas.openxmlformats.org/drawingml/2006/main" xmlns:pic="http://schemas.openxmlformats.org/drawingml/2006/picture">
-            <wp:extent cx="6264000" cy="2581100"/>
+            <wp:extent cx="6264000" cy="2596072"/>
             <wp:docPr id="4" name="Picture 4"/>
             <wp:cNvGraphicFramePr>
               <a:graphicFrameLocks noChangeAspect="1"/>
@@ -2201,7 +2211,7 @@
                   <pic:spPr>
                     <a:xfrm>
                       <a:off x="0" y="0"/>
-                      <a:ext cx="6264000" cy="2581100"/>
+                      <a:ext cx="6264000" cy="2596072"/>
                     </a:xfrm>
                     <a:prstGeom prst="rect"/>
                   </pic:spPr>
@@ -2292,13 +2302,13 @@
       </w:pPr>
       <w:r>
         <w:rPr/>
-        <w:t>Two of the four docking protocols reproduced the experimental ligand pose from both its crystal conformation and from SMILES: KRAS-G12D (0.51 and 1.25 Å) and PARP1 (0.51 and 1.27 Å) (Figure 5a). The other two did not, and each failure carried information. The tau study had first docked into a fibril structure without any ligand, with a box centred on previously docked poses, so that the protocol could not fail; in a cryo-EM structure with a bound tracer</w:t>
+        <w:t>Two of the four docking protocols reproduced the experimental ligand pose from both its crystal conformation and from SMILES: KRAS-G12D (0.51 and 1.25 Å) and PARP1 (0.51 and 1.27 Å) (Figure 5a, Table S4). The other two did not, and each failure carried information. The tau study had first docked into a fibril structure without any ligand, with a box centred on previously docked poses, so that the protocol could not fail; in a cryo-EM structure with a bound tracer</w:t>
       </w:r>
       <w:r>
         <w:rPr>
           <w:vertAlign w:val="superscript"/>
         </w:rPr>
-        <w:t>29</w:t>
+        <w:t>34</w:t>
       </w:r>
       <w:r>
         <w:rPr/>
@@ -2308,7 +2318,7 @@
         <w:rPr>
           <w:vertAlign w:val="superscript"/>
         </w:rPr>
-        <w:t>30</w:t>
+        <w:t>35</w:t>
       </w:r>
       <w:r>
         <w:rPr/>
@@ -2343,7 +2353,7 @@
       <w:r>
         <w:drawing>
           <wp:inline xmlns:a="http://schemas.openxmlformats.org/drawingml/2006/main" xmlns:pic="http://schemas.openxmlformats.org/drawingml/2006/picture">
-            <wp:extent cx="6264000" cy="2868291"/>
+            <wp:extent cx="6264000" cy="2884928"/>
             <wp:docPr id="5" name="Picture 5"/>
             <wp:cNvGraphicFramePr>
               <a:graphicFrameLocks noChangeAspect="1"/>
@@ -2364,7 +2374,7 @@
                   <pic:spPr>
                     <a:xfrm>
                       <a:off x="0" y="0"/>
-                      <a:ext cx="6264000" cy="2868291"/>
+                      <a:ext cx="6264000" cy="2884928"/>
                     </a:xfrm>
                     <a:prstGeom prst="rect"/>
                   </pic:spPr>
@@ -2435,7 +2445,7 @@
       </w:pPr>
       <w:r>
         <w:rPr/>
-        <w:t>In periodic calculations the drug interacts with its own images. In the 12.1 Å cell of the MXene slab, procarbazine, 13.8 Å long, overlapped its image (0.56 Å between atoms) and was removed from the calculation; the other drugs were rotated where necessary so that their closest image contact was 3.26–4.26 Å. The check is a distance calculation on the starting geometry.</w:t>
+        <w:t>In periodic calculations the drug interacts with its own images. In the 12.1 Å cell of the MXene slab, procarbazine, 13.8 Å long, overlapped its image (0.56 Å between atoms) and was removed from the calculation; the other drugs were rotated where necessary so that their closest image contact was 3.25–4.26 Å. The check is a distance calculation on the starting geometry.</w:t>
       </w:r>
     </w:p>
     <w:p>
@@ -2518,7 +2528,7 @@
       </w:r>
       <w:r>
         <w:rPr/>
-        <w:t xml:space="preserve"> = −0.08 for the interaction energy and −0.08 for the docking score, and the only positive values, 0.23 for tau and 0.17 for the glioblastoma docking score, are carried by the formal charge of four cationic dyes and by molecular size, respectively (Figure 6c). These negative results are the honest outcome of the screens.</w:t>
+        <w:t xml:space="preserve"> = −0.08 for the interaction energy and −0.08 for the docking score, and the only positive values, 0.23 for tau and 0.17 for the glioblastoma docking score, are carried by the formal charge of four cationic dyes and by molecular size, respectively (Figure 6c, Table S5). These negative results are the honest outcome of the screens.</w:t>
       </w:r>
     </w:p>
     <w:p>
@@ -2529,7 +2539,7 @@
       <w:r>
         <w:drawing>
           <wp:inline xmlns:a="http://schemas.openxmlformats.org/drawingml/2006/main" xmlns:pic="http://schemas.openxmlformats.org/drawingml/2006/picture">
-            <wp:extent cx="6264000" cy="2515025"/>
+            <wp:extent cx="6264000" cy="2527702"/>
             <wp:docPr id="6" name="Picture 6"/>
             <wp:cNvGraphicFramePr>
               <a:graphicFrameLocks noChangeAspect="1"/>
@@ -2550,7 +2560,7 @@
                   <pic:spPr>
                     <a:xfrm>
                       <a:off x="0" y="0"/>
-                      <a:ext cx="6264000" cy="2515025"/>
+                      <a:ext cx="6264000" cy="2527702"/>
                     </a:xfrm>
                     <a:prstGeom prst="rect"/>
                   </pic:spPr>
@@ -3312,7 +3322,7 @@
       </w:pPr>
       <w:r>
         <w:rPr/>
-        <w:t>The audit covers four studies by one author, so the frequencies reported here — for instance, 54 of 128 wrong structures — describe these data sets and not the literature. The checks were chosen because they caught real errors; they are not exhaustive, and other failure modes, such as the neglect of solvent or of conformational sampling, are not addressed. The rebuilt studies still rest on gas-phase GFN2-xTB energies for three of the carriers.</w:t>
+        <w:t>The audit covers four studies by one author, so the frequencies reported here — for instance, 55 of 128 wrong structures — describe these data sets and not the literature. The checks were chosen because they caught real errors; they are not exhaustive, and other failure modes, such as the neglect of solvent or of conformational sampling, are not addressed. The rebuilt studies still rest on gas-phase GFN2-xTB energies for three of the carriers.</w:t>
       </w:r>
     </w:p>
     <w:p>
@@ -3362,6 +3372,30 @@
       </w:pPr>
       <w:r>
         <w:rPr/>
+        <w:t>Associated Content</w:t>
+      </w:r>
+    </w:p>
+    <w:p>
+      <w:pPr>
+        <w:jc w:val="both"/>
+      </w:pPr>
+      <w:r>
+        <w:rPr>
+          <w:b/>
+        </w:rPr>
+        <w:t>Supporting Information.</w:t>
+      </w:r>
+      <w:r>
+        <w:rPr/>
+        <w:t xml:space="preserve"> The Supporting Information is available free of charge: identity of the 128 drug structures (Table S1), bond census of the carrier models (Table S2), carrier energy in each tau complex before and after the rebuild (Table S3), redocking controls of the four studies (Table S4) and the QSPR models before and after the rebuild (Table S5) (PDF).</w:t>
+      </w:r>
+    </w:p>
+    <w:p>
+      <w:pPr>
+        <w:pStyle w:val="Heading1"/>
+      </w:pPr>
+      <w:r>
+        <w:rPr/>
         <w:t>Data and Software Availability</w:t>
       </w:r>
     </w:p>
@@ -4409,46 +4443,7 @@
         <w:rPr>
           <w:sz w:val="20"/>
         </w:rPr>
-        <w:t xml:space="preserve">(21) Kim, S.; Chen, J.; Cheng, T.; Gindulyte, A.; He, J.; He, S.; Li, Q.; Shoemaker, B. A.; Thiessen, P. A.; Yu, B.; et al. PubChem in 2021: new data content and improved web interfaces. </w:t>
-      </w:r>
-      <w:r>
-        <w:rPr>
-          <w:i/>
-          <w:sz w:val="20"/>
-        </w:rPr>
-        <w:t>Nucleic Acids Res.</w:t>
-      </w:r>
-      <w:r>
-        <w:rPr>
-          <w:sz w:val="20"/>
-        </w:rPr>
-        <w:t xml:space="preserve"> </w:t>
-      </w:r>
-      <w:r>
-        <w:rPr>
-          <w:b/>
-          <w:sz w:val="20"/>
-        </w:rPr>
-        <w:t>2021</w:t>
-      </w:r>
-      <w:r>
-        <w:rPr>
-          <w:sz w:val="20"/>
-        </w:rPr>
-        <w:t xml:space="preserve">, </w:t>
-      </w:r>
-      <w:r>
-        <w:rPr>
-          <w:i/>
-          <w:sz w:val="20"/>
-        </w:rPr>
-        <w:t>49</w:t>
-      </w:r>
-      <w:r>
-        <w:rPr>
-          <w:sz w:val="20"/>
-        </w:rPr>
-        <w:t>, D1388–D1395. https://doi.org/10.1093/nar/gkaa971</w:t>
+        <w:t>(21) Monreal Hernández, A. Atomistic Modeling and QSPR-Guided Screening of 2D Graphitic Carbon Nitride Nanocarriers for KRAS-G12D Inhibitor Loading and Target Engagement, version 2.0.0. Zenodo, 2026. https://doi.org/10.5281/zenodo.22700431</w:t>
       </w:r>
     </w:p>
     <w:p>
@@ -4460,46 +4455,7 @@
         <w:rPr>
           <w:sz w:val="20"/>
         </w:rPr>
-        <w:t xml:space="preserve">(22) Grimme, S.; Bannwarth, C.; Shushkov, P. A Robust and Accurate Tight-Binding Quantum Chemical Method for Structures, Vibrational Frequencies, and Noncovalent Interactions of Large Molecular Systems Parametrized for All spd-Block Elements ( Z = 1–86). </w:t>
-      </w:r>
-      <w:r>
-        <w:rPr>
-          <w:i/>
-          <w:sz w:val="20"/>
-        </w:rPr>
-        <w:t>J. Chem. Theory Comput.</w:t>
-      </w:r>
-      <w:r>
-        <w:rPr>
-          <w:sz w:val="20"/>
-        </w:rPr>
-        <w:t xml:space="preserve"> </w:t>
-      </w:r>
-      <w:r>
-        <w:rPr>
-          <w:b/>
-          <w:sz w:val="20"/>
-        </w:rPr>
-        <w:t>2017</w:t>
-      </w:r>
-      <w:r>
-        <w:rPr>
-          <w:sz w:val="20"/>
-        </w:rPr>
-        <w:t xml:space="preserve">, </w:t>
-      </w:r>
-      <w:r>
-        <w:rPr>
-          <w:i/>
-          <w:sz w:val="20"/>
-        </w:rPr>
-        <w:t>13</w:t>
-      </w:r>
-      <w:r>
-        <w:rPr>
-          <w:sz w:val="20"/>
-        </w:rPr>
-        <w:t>, 1989–2009. https://doi.org/10.1021/acs.jctc.7b00118</w:t>
+        <w:t>(22) Monreal Hernández, A. Explainable AI and Quantum-Guided QSAR/QSPR Modeling of Triple-Negative Breast Cancer Therapeutics Loading on 2D Nanomaterials, version 2.0.0. Zenodo, 2026. https://doi.org/10.5281/zenodo.22700597</w:t>
       </w:r>
     </w:p>
     <w:p>
@@ -4511,7 +4467,7 @@
         <w:rPr>
           <w:sz w:val="20"/>
         </w:rPr>
-        <w:t>(23) RDKit: Open-Source Cheminformatics, version 2024.03. https://www.rdkit.org (accessed 2026-09-26).</w:t>
+        <w:t>(23) Monreal Hernández, A. Explainable AI and Quantum Chemical Exploration of 2D Titanium Carbide MXene (Ti3C2Tx) Nanocarriers for Glioblastoma Therapeutics, version 2.0.0. Zenodo, 2026. https://doi.org/10.5281/zenodo.22700227</w:t>
       </w:r>
     </w:p>
     <w:p>
@@ -4523,7 +4479,7 @@
         <w:rPr>
           <w:sz w:val="20"/>
         </w:rPr>
-        <w:t>(24) Pedregosa, F.; Varoquaux, G.; Gramfort, A.; Michel, V.; Thirion, B.; Grisel, O.; Blondel, M.; Prettenhofer, P.; Weiss, R.; Dubourg, V.; et al. Scikit-learn: Machine Learning in Python. J. Mach. Learn. Res. 2011, 12, 2825–2830.</w:t>
+        <w:t>(24) Monreal Hernández, A. Machine Learning-Driven Nano-QSAR and Quantum Chemical Design of Functionalized 2D Borophene Nanocarriers for Alzheimer's Tau-Targeted Therapeutics, version 2.0.1. Zenodo, 2026. https://doi.org/10.5281/zenodo.22700723</w:t>
       </w:r>
     </w:p>
     <w:p>
@@ -4535,46 +4491,7 @@
         <w:rPr>
           <w:sz w:val="20"/>
         </w:rPr>
-        <w:t xml:space="preserve">(25) Giannozzi, P.; Andreussi, O.; Brumme, T.; Bunau, O.; Buongiorno Nardelli, M.; Calandra, M.; Car, R.; Cavazzoni, C.; Ceresoli, D.; Cococcioni, M.; et al. Advanced capabilities for materials modelling with Q uantum ESPRESSO. </w:t>
-      </w:r>
-      <w:r>
-        <w:rPr>
-          <w:i/>
-          <w:sz w:val="20"/>
-        </w:rPr>
-        <w:t>J. Phys.: Condens. Matter</w:t>
-      </w:r>
-      <w:r>
-        <w:rPr>
-          <w:sz w:val="20"/>
-        </w:rPr>
-        <w:t xml:space="preserve"> </w:t>
-      </w:r>
-      <w:r>
-        <w:rPr>
-          <w:b/>
-          <w:sz w:val="20"/>
-        </w:rPr>
-        <w:t>2017</w:t>
-      </w:r>
-      <w:r>
-        <w:rPr>
-          <w:sz w:val="20"/>
-        </w:rPr>
-        <w:t xml:space="preserve">, </w:t>
-      </w:r>
-      <w:r>
-        <w:rPr>
-          <w:i/>
-          <w:sz w:val="20"/>
-        </w:rPr>
-        <w:t>29</w:t>
-      </w:r>
-      <w:r>
-        <w:rPr>
-          <w:sz w:val="20"/>
-        </w:rPr>
-        <w:t>, 465901. https://doi.org/10.1088/1361-648x/aa8f79</w:t>
+        <w:t>(25) Monreal Hernández, A. Don't Fool Yourself When Screening 2D-Nanomaterial Drug Carriers: A Reproducible GFN2-xTB + Docking + Leak-Free QSAR Pipeline, Four Disease Case Studies, and a Cautionary Tale, version 1.0.1. Zenodo, 2026. https://doi.org/10.5281/zenodo.22760388</w:t>
       </w:r>
     </w:p>
     <w:p>
@@ -4586,14 +4503,14 @@
         <w:rPr>
           <w:sz w:val="20"/>
         </w:rPr>
-        <w:t xml:space="preserve">(26) Perdew, J. P.; Burke, K.; Ernzerhof, M. Generalized Gradient Approximation Made Simple. </w:t>
+        <w:t xml:space="preserve">(26) Kim, S.; Chen, J.; Cheng, T.; Gindulyte, A.; He, J.; He, S.; Li, Q.; Shoemaker, B. A.; Thiessen, P. A.; Yu, B.; et al. PubChem in 2021: new data content and improved web interfaces. </w:t>
       </w:r>
       <w:r>
         <w:rPr>
           <w:i/>
           <w:sz w:val="20"/>
         </w:rPr>
-        <w:t>Phys. Rev. Lett.</w:t>
+        <w:t>Nucleic Acids Res.</w:t>
       </w:r>
       <w:r>
         <w:rPr>
@@ -4606,7 +4523,7 @@
           <w:b/>
           <w:sz w:val="20"/>
         </w:rPr>
-        <w:t>1996</w:t>
+        <w:t>2021</w:t>
       </w:r>
       <w:r>
         <w:rPr>
@@ -4619,13 +4536,13 @@
           <w:i/>
           <w:sz w:val="20"/>
         </w:rPr>
-        <w:t>77</w:t>
+        <w:t>49</w:t>
       </w:r>
       <w:r>
         <w:rPr>
           <w:sz w:val="20"/>
         </w:rPr>
-        <w:t>, 3865–3868. https://doi.org/10.1103/physrevlett.77.3865</w:t>
+        <w:t>, D1388–D1395. https://doi.org/10.1093/nar/gkaa971</w:t>
       </w:r>
     </w:p>
     <w:p>
@@ -4637,14 +4554,14 @@
         <w:rPr>
           <w:sz w:val="20"/>
         </w:rPr>
-        <w:t xml:space="preserve">(27) Grimme, S.; Antony, J.; Ehrlich, S.; Krieg, H. A consistent and accurate ab initio parametrization of density functional dispersion correction (DFT-D) for the 94 elements H-Pu. </w:t>
+        <w:t xml:space="preserve">(27) Grimme, S.; Bannwarth, C.; Shushkov, P. A Robust and Accurate Tight-Binding Quantum Chemical Method for Structures, Vibrational Frequencies, and Noncovalent Interactions of Large Molecular Systems Parametrized for All spd-Block Elements ( Z = 1–86). </w:t>
       </w:r>
       <w:r>
         <w:rPr>
           <w:i/>
           <w:sz w:val="20"/>
         </w:rPr>
-        <w:t>J. Chem. Phys.</w:t>
+        <w:t>J. Chem. Theory Comput.</w:t>
       </w:r>
       <w:r>
         <w:rPr>
@@ -4657,7 +4574,7 @@
           <w:b/>
           <w:sz w:val="20"/>
         </w:rPr>
-        <w:t>2010</w:t>
+        <w:t>2017</w:t>
       </w:r>
       <w:r>
         <w:rPr>
@@ -4670,13 +4587,13 @@
           <w:i/>
           <w:sz w:val="20"/>
         </w:rPr>
-        <w:t>132</w:t>
+        <w:t>13</w:t>
       </w:r>
       <w:r>
         <w:rPr>
           <w:sz w:val="20"/>
         </w:rPr>
-        <w:t>, 154104. https://doi.org/10.1063/1.3382344</w:t>
+        <w:t>, 1989–2009. https://doi.org/10.1021/acs.jctc.7b00118</w:t>
       </w:r>
     </w:p>
     <w:p>
@@ -4688,46 +4605,7 @@
         <w:rPr>
           <w:sz w:val="20"/>
         </w:rPr>
-        <w:t xml:space="preserve">(28) Khazaei, M.; Arai, M.; Sasaki, T.; Chung, C.; Venkataramanan, N. S.; Estili, M.; Sakka, Y.; Kawazoe, Y. Novel Electronic and Magnetic Properties of Two‐Dimensional Transition Metal Carbides and Nitrides. </w:t>
-      </w:r>
-      <w:r>
-        <w:rPr>
-          <w:i/>
-          <w:sz w:val="20"/>
-        </w:rPr>
-        <w:t>Adv. Funct. Mater.</w:t>
-      </w:r>
-      <w:r>
-        <w:rPr>
-          <w:sz w:val="20"/>
-        </w:rPr>
-        <w:t xml:space="preserve"> </w:t>
-      </w:r>
-      <w:r>
-        <w:rPr>
-          <w:b/>
-          <w:sz w:val="20"/>
-        </w:rPr>
-        <w:t>2013</w:t>
-      </w:r>
-      <w:r>
-        <w:rPr>
-          <w:sz w:val="20"/>
-        </w:rPr>
-        <w:t xml:space="preserve">, </w:t>
-      </w:r>
-      <w:r>
-        <w:rPr>
-          <w:i/>
-          <w:sz w:val="20"/>
-        </w:rPr>
-        <w:t>23</w:t>
-      </w:r>
-      <w:r>
-        <w:rPr>
-          <w:sz w:val="20"/>
-        </w:rPr>
-        <w:t>, 2185–2192. https://doi.org/10.1002/adfm.201202502</w:t>
+        <w:t>(28) RDKit: Open-Source Cheminformatics, version 2024.03. https://www.rdkit.org (accessed 2026-09-26).</w:t>
       </w:r>
     </w:p>
     <w:p>
@@ -4739,46 +4617,7 @@
         <w:rPr>
           <w:sz w:val="20"/>
         </w:rPr>
-        <w:t xml:space="preserve">(29) Merz, G. E.; Chalkley, M. J.; Tan, S. K.; Tse, E.; Lee, J.; Prusiner, S. B.; Paras, N. A.; DeGrado, W. F.; Southworth, D. R. Stacked binding of a PET ligand to Alzheimer’s tau paired helical filaments. </w:t>
-      </w:r>
-      <w:r>
-        <w:rPr>
-          <w:i/>
-          <w:sz w:val="20"/>
-        </w:rPr>
-        <w:t>Nat. Commun.</w:t>
-      </w:r>
-      <w:r>
-        <w:rPr>
-          <w:sz w:val="20"/>
-        </w:rPr>
-        <w:t xml:space="preserve"> </w:t>
-      </w:r>
-      <w:r>
-        <w:rPr>
-          <w:b/>
-          <w:sz w:val="20"/>
-        </w:rPr>
-        <w:t>2023</w:t>
-      </w:r>
-      <w:r>
-        <w:rPr>
-          <w:sz w:val="20"/>
-        </w:rPr>
-        <w:t xml:space="preserve">, </w:t>
-      </w:r>
-      <w:r>
-        <w:rPr>
-          <w:i/>
-          <w:sz w:val="20"/>
-        </w:rPr>
-        <w:t>14</w:t>
-      </w:r>
-      <w:r>
-        <w:rPr>
-          <w:sz w:val="20"/>
-        </w:rPr>
-        <w:t>, 3048. https://doi.org/10.1038/s41467-023-38537-y</w:t>
+        <w:t>(29) Pedregosa, F.; Varoquaux, G.; Gramfort, A.; Michel, V.; Thirion, B.; Grisel, O.; Blondel, M.; Prettenhofer, P.; Weiss, R.; Dubourg, V.; et al. Scikit-learn: Machine Learning in Python. J. Mach. Learn. Res. 2011, 12, 2825–2830.</w:t>
       </w:r>
     </w:p>
     <w:p>
@@ -4790,7 +4629,262 @@
         <w:rPr>
           <w:sz w:val="20"/>
         </w:rPr>
-        <w:t xml:space="preserve">(30) Stamos, J.; Sliwkowski, M. X.; Eigenbrot, C. Structure of the Epidermal Growth Factor Receptor Kinase Domain Alone and in Complex with a 4-Anilinoquinazoline Inhibitor. </w:t>
+        <w:t xml:space="preserve">(30) Giannozzi, P.; Andreussi, O.; Brumme, T.; Bunau, O.; Buongiorno Nardelli, M.; Calandra, M.; Car, R.; Cavazzoni, C.; Ceresoli, D.; Cococcioni, M.; et al. Advanced capabilities for materials modelling with Q uantum ESPRESSO. </w:t>
+      </w:r>
+      <w:r>
+        <w:rPr>
+          <w:i/>
+          <w:sz w:val="20"/>
+        </w:rPr>
+        <w:t>J. Phys.: Condens. Matter</w:t>
+      </w:r>
+      <w:r>
+        <w:rPr>
+          <w:sz w:val="20"/>
+        </w:rPr>
+        <w:t xml:space="preserve"> </w:t>
+      </w:r>
+      <w:r>
+        <w:rPr>
+          <w:b/>
+          <w:sz w:val="20"/>
+        </w:rPr>
+        <w:t>2017</w:t>
+      </w:r>
+      <w:r>
+        <w:rPr>
+          <w:sz w:val="20"/>
+        </w:rPr>
+        <w:t xml:space="preserve">, </w:t>
+      </w:r>
+      <w:r>
+        <w:rPr>
+          <w:i/>
+          <w:sz w:val="20"/>
+        </w:rPr>
+        <w:t>29</w:t>
+      </w:r>
+      <w:r>
+        <w:rPr>
+          <w:sz w:val="20"/>
+        </w:rPr>
+        <w:t>, 465901. https://doi.org/10.1088/1361-648x/aa8f79</w:t>
+      </w:r>
+    </w:p>
+    <w:p>
+      <w:pPr>
+        <w:spacing w:after="60"/>
+        <w:ind w:left="454" w:hanging="454"/>
+      </w:pPr>
+      <w:r>
+        <w:rPr>
+          <w:sz w:val="20"/>
+        </w:rPr>
+        <w:t xml:space="preserve">(31) Perdew, J. P.; Burke, K.; Ernzerhof, M. Generalized Gradient Approximation Made Simple. </w:t>
+      </w:r>
+      <w:r>
+        <w:rPr>
+          <w:i/>
+          <w:sz w:val="20"/>
+        </w:rPr>
+        <w:t>Phys. Rev. Lett.</w:t>
+      </w:r>
+      <w:r>
+        <w:rPr>
+          <w:sz w:val="20"/>
+        </w:rPr>
+        <w:t xml:space="preserve"> </w:t>
+      </w:r>
+      <w:r>
+        <w:rPr>
+          <w:b/>
+          <w:sz w:val="20"/>
+        </w:rPr>
+        <w:t>1996</w:t>
+      </w:r>
+      <w:r>
+        <w:rPr>
+          <w:sz w:val="20"/>
+        </w:rPr>
+        <w:t xml:space="preserve">, </w:t>
+      </w:r>
+      <w:r>
+        <w:rPr>
+          <w:i/>
+          <w:sz w:val="20"/>
+        </w:rPr>
+        <w:t>77</w:t>
+      </w:r>
+      <w:r>
+        <w:rPr>
+          <w:sz w:val="20"/>
+        </w:rPr>
+        <w:t>, 3865–3868. https://doi.org/10.1103/physrevlett.77.3865</w:t>
+      </w:r>
+    </w:p>
+    <w:p>
+      <w:pPr>
+        <w:spacing w:after="60"/>
+        <w:ind w:left="454" w:hanging="454"/>
+      </w:pPr>
+      <w:r>
+        <w:rPr>
+          <w:sz w:val="20"/>
+        </w:rPr>
+        <w:t xml:space="preserve">(32) Grimme, S.; Antony, J.; Ehrlich, S.; Krieg, H. A consistent and accurate ab initio parametrization of density functional dispersion correction (DFT-D) for the 94 elements H-Pu. </w:t>
+      </w:r>
+      <w:r>
+        <w:rPr>
+          <w:i/>
+          <w:sz w:val="20"/>
+        </w:rPr>
+        <w:t>J. Chem. Phys.</w:t>
+      </w:r>
+      <w:r>
+        <w:rPr>
+          <w:sz w:val="20"/>
+        </w:rPr>
+        <w:t xml:space="preserve"> </w:t>
+      </w:r>
+      <w:r>
+        <w:rPr>
+          <w:b/>
+          <w:sz w:val="20"/>
+        </w:rPr>
+        <w:t>2010</w:t>
+      </w:r>
+      <w:r>
+        <w:rPr>
+          <w:sz w:val="20"/>
+        </w:rPr>
+        <w:t xml:space="preserve">, </w:t>
+      </w:r>
+      <w:r>
+        <w:rPr>
+          <w:i/>
+          <w:sz w:val="20"/>
+        </w:rPr>
+        <w:t>132</w:t>
+      </w:r>
+      <w:r>
+        <w:rPr>
+          <w:sz w:val="20"/>
+        </w:rPr>
+        <w:t>, 154104. https://doi.org/10.1063/1.3382344</w:t>
+      </w:r>
+    </w:p>
+    <w:p>
+      <w:pPr>
+        <w:spacing w:after="60"/>
+        <w:ind w:left="454" w:hanging="454"/>
+      </w:pPr>
+      <w:r>
+        <w:rPr>
+          <w:sz w:val="20"/>
+        </w:rPr>
+        <w:t xml:space="preserve">(33) Khazaei, M.; Arai, M.; Sasaki, T.; Chung, C.; Venkataramanan, N. S.; Estili, M.; Sakka, Y.; Kawazoe, Y. Novel Electronic and Magnetic Properties of Two‐Dimensional Transition Metal Carbides and Nitrides. </w:t>
+      </w:r>
+      <w:r>
+        <w:rPr>
+          <w:i/>
+          <w:sz w:val="20"/>
+        </w:rPr>
+        <w:t>Adv. Funct. Mater.</w:t>
+      </w:r>
+      <w:r>
+        <w:rPr>
+          <w:sz w:val="20"/>
+        </w:rPr>
+        <w:t xml:space="preserve"> </w:t>
+      </w:r>
+      <w:r>
+        <w:rPr>
+          <w:b/>
+          <w:sz w:val="20"/>
+        </w:rPr>
+        <w:t>2013</w:t>
+      </w:r>
+      <w:r>
+        <w:rPr>
+          <w:sz w:val="20"/>
+        </w:rPr>
+        <w:t xml:space="preserve">, </w:t>
+      </w:r>
+      <w:r>
+        <w:rPr>
+          <w:i/>
+          <w:sz w:val="20"/>
+        </w:rPr>
+        <w:t>23</w:t>
+      </w:r>
+      <w:r>
+        <w:rPr>
+          <w:sz w:val="20"/>
+        </w:rPr>
+        <w:t>, 2185–2192. https://doi.org/10.1002/adfm.201202502</w:t>
+      </w:r>
+    </w:p>
+    <w:p>
+      <w:pPr>
+        <w:spacing w:after="60"/>
+        <w:ind w:left="454" w:hanging="454"/>
+      </w:pPr>
+      <w:r>
+        <w:rPr>
+          <w:sz w:val="20"/>
+        </w:rPr>
+        <w:t xml:space="preserve">(34) Merz, G. E.; Chalkley, M. J.; Tan, S. K.; Tse, E.; Lee, J.; Prusiner, S. B.; Paras, N. A.; DeGrado, W. F.; Southworth, D. R. Stacked binding of a PET ligand to Alzheimer’s tau paired helical filaments. </w:t>
+      </w:r>
+      <w:r>
+        <w:rPr>
+          <w:i/>
+          <w:sz w:val="20"/>
+        </w:rPr>
+        <w:t>Nat. Commun.</w:t>
+      </w:r>
+      <w:r>
+        <w:rPr>
+          <w:sz w:val="20"/>
+        </w:rPr>
+        <w:t xml:space="preserve"> </w:t>
+      </w:r>
+      <w:r>
+        <w:rPr>
+          <w:b/>
+          <w:sz w:val="20"/>
+        </w:rPr>
+        <w:t>2023</w:t>
+      </w:r>
+      <w:r>
+        <w:rPr>
+          <w:sz w:val="20"/>
+        </w:rPr>
+        <w:t xml:space="preserve">, </w:t>
+      </w:r>
+      <w:r>
+        <w:rPr>
+          <w:i/>
+          <w:sz w:val="20"/>
+        </w:rPr>
+        <w:t>14</w:t>
+      </w:r>
+      <w:r>
+        <w:rPr>
+          <w:sz w:val="20"/>
+        </w:rPr>
+        <w:t>, 3048. https://doi.org/10.1038/s41467-023-38537-y</w:t>
+      </w:r>
+    </w:p>
+    <w:p>
+      <w:pPr>
+        <w:spacing w:after="60"/>
+        <w:ind w:left="454" w:hanging="454"/>
+      </w:pPr>
+      <w:r>
+        <w:rPr>
+          <w:sz w:val="20"/>
+        </w:rPr>
+        <w:t xml:space="preserve">(35) Stamos, J.; Sliwkowski, M. X.; Eigenbrot, C. Structure of the Epidermal Growth Factor Receptor Kinase Domain Alone and in Complex with a 4-Anilinoquinazoline Inhibitor. </w:t>
       </w:r>
       <w:r>
         <w:rPr>

</xml_diff>

<commit_message>
Fig. 1 redrawn: stage cards with real renders (PyMOL, RDKit) and the result of each check
- B36N36 cage rendered without the B...B 4-ring diagonals that PyMOL would draw as bonds
- clean periodic Ti3C2O2 block showing the seven atomic layers
- every red finding computed from audit_evidence.json; caption updated

Co-Authored-By: Claude Opus 5.5 <noreply@anthropic.com>
</commit_message>
<xml_diff>
--- a/manuscript/submission/Manuscript_Audit_JCIM.docx
+++ b/manuscript/submission/Manuscript_Audit_JCIM.docx
@@ -468,7 +468,7 @@
       <w:r>
         <w:drawing>
           <wp:inline xmlns:a="http://schemas.openxmlformats.org/drawingml/2006/main" xmlns:pic="http://schemas.openxmlformats.org/drawingml/2006/picture">
-            <wp:extent cx="6264000" cy="1725583"/>
+            <wp:extent cx="6264000" cy="1950789"/>
             <wp:docPr id="1" name="Picture 1"/>
             <wp:cNvGraphicFramePr>
               <a:graphicFrameLocks noChangeAspect="1"/>
@@ -489,7 +489,7 @@
                   <pic:spPr>
                     <a:xfrm>
                       <a:off x="0" y="0"/>
-                      <a:ext cx="6264000" cy="1725583"/>
+                      <a:ext cx="6264000" cy="1950789"/>
                     </a:xfrm>
                     <a:prstGeom prst="rect"/>
                   </pic:spPr>
@@ -522,7 +522,98 @@
         <w:rPr>
           <w:sz w:val="20"/>
         </w:rPr>
-        <w:t>Workflow of a computational carrier screen and the eight checks of the audit, each attached to the step it protects; the numbers correspond to the failure modes in the Results and to the checklist in Table 2.</w:t>
+        <w:t>Workflow of a computational carrier screen and the eight checks of the audit. Each check is attached to the step it protects, and its number corresponds to the failure mode in the Results and to the checklist in Table 2; the red line gives what the check found in the audit of the four studies. Images, from the rebuilt studies: MRTX1133; the B</w:t>
+      </w:r>
+      <w:r>
+        <w:rPr>
+          <w:sz w:val="20"/>
+          <w:vertAlign w:val="subscript"/>
+        </w:rPr>
+        <w:t>36</w:t>
+      </w:r>
+      <w:r>
+        <w:rPr>
+          <w:sz w:val="20"/>
+        </w:rPr>
+        <w:t>N</w:t>
+      </w:r>
+      <w:r>
+        <w:rPr>
+          <w:sz w:val="20"/>
+          <w:vertAlign w:val="subscript"/>
+        </w:rPr>
+        <w:t>36</w:t>
+      </w:r>
+      <w:r>
+        <w:rPr>
+          <w:sz w:val="20"/>
+        </w:rPr>
+        <w:t xml:space="preserve"> cage; the Ti</w:t>
+      </w:r>
+      <w:r>
+        <w:rPr>
+          <w:sz w:val="20"/>
+          <w:vertAlign w:val="subscript"/>
+        </w:rPr>
+        <w:t>3</w:t>
+      </w:r>
+      <w:r>
+        <w:rPr>
+          <w:sz w:val="20"/>
+        </w:rPr>
+        <w:t>C</w:t>
+      </w:r>
+      <w:r>
+        <w:rPr>
+          <w:sz w:val="20"/>
+          <w:vertAlign w:val="subscript"/>
+        </w:rPr>
+        <w:t>2</w:t>
+      </w:r>
+      <w:r>
+        <w:rPr>
+          <w:sz w:val="20"/>
+        </w:rPr>
+        <w:t>O</w:t>
+      </w:r>
+      <w:r>
+        <w:rPr>
+          <w:sz w:val="20"/>
+          <w:vertAlign w:val="subscript"/>
+        </w:rPr>
+        <w:t>2</w:t>
+      </w:r>
+      <w:r>
+        <w:rPr>
+          <w:sz w:val="20"/>
+        </w:rPr>
+        <w:t xml:space="preserve"> MXene; MRTX1133 adsorbed on g-C</w:t>
+      </w:r>
+      <w:r>
+        <w:rPr>
+          <w:sz w:val="20"/>
+          <w:vertAlign w:val="subscript"/>
+        </w:rPr>
+        <w:t>3</w:t>
+      </w:r>
+      <w:r>
+        <w:rPr>
+          <w:sz w:val="20"/>
+        </w:rPr>
+        <w:t>N</w:t>
+      </w:r>
+      <w:r>
+        <w:rPr>
+          <w:sz w:val="20"/>
+          <w:vertAlign w:val="subscript"/>
+        </w:rPr>
+        <w:t>4</w:t>
+      </w:r>
+      <w:r>
+        <w:rPr>
+          <w:sz w:val="20"/>
+        </w:rPr>
+        <w:t xml:space="preserve"> (GFN2-xTB); MRTX1133 docked in KRAS-G12D; a result table in which every row must point to an input structure and an output file; and out-of-fold predictions of the QSPR model of the KRAS interaction energy.</w:t>
       </w:r>
     </w:p>
     <w:p>

</xml_diff>

<commit_message>
Figs. 2-3: renders of the invalid carriers and of the collapsing tau flake; overlapping atoms audited
- carrier audit now reports the closest atom pair and overlapping pairs (< 0.6 x sum of
  covalent radii): the pre-rebuild B36N36 cage had 36 B/N pairs 0.57-0.64 A apart
- Fig. 2c: KRAS/TNBC/GBM carriers before the rebuild, forbidden bonds in amber
- Fig. 3c: galantamine on the free B40H15 flake (collapsed) vs the supported sheet
- Fig. 6: minus sign; text, SI Table S2 and captions updated

Co-Authored-By: Claude Opus 5.5 <noreply@anthropic.com>
</commit_message>
<xml_diff>
--- a/manuscript/submission/Manuscript_Audit_JCIM.docx
+++ b/manuscript/submission/Manuscript_Audit_JCIM.docx
@@ -705,7 +705,7 @@
       </w:r>
       <w:r>
         <w:rPr/>
-        <w:t xml:space="preserve"> ring (about 1.86 Å) falls inside the bond criterion; such pairs, recognized because they share two nitrogen neighbours, were counted separately and not as bonds.</w:t>
+        <w:t xml:space="preserve"> ring (about 1.86 Å) falls inside the bond criterion; such pairs, recognized because they share two nitrogen neighbours, were counted separately and not as bonds. Pairs closer than 0.6 times the sum of the covalent radii, which no chemical bond reaches, were counted as overlapping atoms.</w:t>
       </w:r>
     </w:p>
     <w:p>
@@ -1736,7 +1736,7 @@
       </w:r>
       <w:r>
         <w:rPr/>
-        <w:t>. The graphitic carbon nitride model of the KRAS study, C</w:t>
+        <w:t>. Worse, 36 of those B–N pairs were atoms placed almost on top of each other, as close as 0.57 Å. The graphitic carbon nitride model of the KRAS study, C</w:t>
       </w:r>
       <w:r>
         <w:rPr>
@@ -1923,7 +1923,7 @@
       <w:r>
         <w:drawing>
           <wp:inline xmlns:a="http://schemas.openxmlformats.org/drawingml/2006/main" xmlns:pic="http://schemas.openxmlformats.org/drawingml/2006/picture">
-            <wp:extent cx="6264000" cy="2756558"/>
+            <wp:extent cx="6264000" cy="4216852"/>
             <wp:docPr id="2" name="Picture 2"/>
             <wp:cNvGraphicFramePr>
               <a:graphicFrameLocks noChangeAspect="1"/>
@@ -1944,7 +1944,7 @@
                   <pic:spPr>
                     <a:xfrm>
                       <a:off x="0" y="0"/>
-                      <a:ext cx="6264000" cy="2756558"/>
+                      <a:ext cx="6264000" cy="4216852"/>
                     </a:xfrm>
                     <a:prstGeom prst="rect"/>
                   </pic:spPr>
@@ -1977,7 +1977,33 @@
         <w:rPr>
           <w:sz w:val="20"/>
         </w:rPr>
-        <w:t>Identity of the drugs and validity of the carriers before the rebuild. (a) Drug structures that match PubChem and structures that encode a different compound, per study; hatched, same formula but different connectivity. (b) Bonds that the ideal material cannot contain, in the carrier models before and after the rebuild; formulas below each study.</w:t>
+        <w:t>Identity of the drugs and validity of the carriers before the rebuild. (a) Drug structures that match PubChem and structures that encode a different compound, per study; hatched, same formula but different connectivity. (b) Bonds that the ideal material cannot contain, in the carrier models before and after the rebuild; formulas below each study. (c) The three invalid carrier models, drawn with the bond criterion of the audit; bonds that the material cannot contain in amber. In the B</w:t>
+      </w:r>
+      <w:r>
+        <w:rPr>
+          <w:sz w:val="20"/>
+          <w:vertAlign w:val="subscript"/>
+        </w:rPr>
+        <w:t>36</w:t>
+      </w:r>
+      <w:r>
+        <w:rPr>
+          <w:sz w:val="20"/>
+        </w:rPr>
+        <w:t>N</w:t>
+      </w:r>
+      <w:r>
+        <w:rPr>
+          <w:sz w:val="20"/>
+          <w:vertAlign w:val="subscript"/>
+        </w:rPr>
+        <w:t>36</w:t>
+      </w:r>
+      <w:r>
+        <w:rPr>
+          <w:sz w:val="20"/>
+        </w:rPr>
+        <w:t xml:space="preserve"> model, pairs of boron and nitrogen atoms sit almost on top of each other.</w:t>
       </w:r>
     </w:p>
     <w:p>
@@ -2147,7 +2173,7 @@
       <w:r>
         <w:drawing>
           <wp:inline xmlns:a="http://schemas.openxmlformats.org/drawingml/2006/main" xmlns:pic="http://schemas.openxmlformats.org/drawingml/2006/picture">
-            <wp:extent cx="6264000" cy="2520963"/>
+            <wp:extent cx="6264000" cy="4745137"/>
             <wp:docPr id="3" name="Picture 3"/>
             <wp:cNvGraphicFramePr>
               <a:graphicFrameLocks noChangeAspect="1"/>
@@ -2168,7 +2194,7 @@
                   <pic:spPr>
                     <a:xfrm>
                       <a:off x="0" y="0"/>
-                      <a:ext cx="6264000" cy="2520963"/>
+                      <a:ext cx="6264000" cy="4745137"/>
                     </a:xfrm>
                     <a:prstGeom prst="rect"/>
                   </pic:spPr>
@@ -2201,7 +2227,46 @@
         <w:rPr>
           <w:sz w:val="20"/>
         </w:rPr>
-        <w:t>Carrier reconstruction during adsorption. (a) Energy of the carrier fragment frozen at its geometry in each complex, relative to the relaxed carrier; negative values (shaded) mean that the carrier reached a structure below its own minimum. (b) Number of tau drugs classified as chemisorbed on the free flake and on the supported sheet.</w:t>
+        <w:t>Carrier reconstruction during adsorption. (a) Energy of the carrier fragment frozen at its geometry in each complex, relative to the relaxed carrier; negative values (shaded) mean that the carrier reached a structure below its own minimum. (b) Number of tau drugs classified as chemisorbed on the free flake and on the supported sheet. (c) Galantamine, the extreme case: the free B</w:t>
+      </w:r>
+      <w:r>
+        <w:rPr>
+          <w:sz w:val="20"/>
+          <w:vertAlign w:val="subscript"/>
+        </w:rPr>
+        <w:t>40</w:t>
+      </w:r>
+      <w:r>
+        <w:rPr>
+          <w:sz w:val="20"/>
+        </w:rPr>
+        <w:t>H</w:t>
+      </w:r>
+      <w:r>
+        <w:rPr>
+          <w:sz w:val="20"/>
+          <w:vertAlign w:val="subscript"/>
+        </w:rPr>
+        <w:t>15</w:t>
+      </w:r>
+      <w:r>
+        <w:rPr>
+          <w:sz w:val="20"/>
+        </w:rPr>
+        <w:t xml:space="preserve"> flake relaxed alone, the same flake in the relaxed complex, which has collapsed into a three-dimensional cluster, and the supported β</w:t>
+      </w:r>
+      <w:r>
+        <w:rPr>
+          <w:sz w:val="20"/>
+          <w:vertAlign w:val="subscript"/>
+        </w:rPr>
+        <w:t>12</w:t>
+      </w:r>
+      <w:r>
+        <w:rPr>
+          <w:sz w:val="20"/>
+        </w:rPr>
+        <w:t xml:space="preserve"> sheet in the relaxed complex (GFN2-xTB, side views).</w:t>
       </w:r>
     </w:p>
     <w:p>

</xml_diff>